<commit_message>
Convenio párrafo de deslinde de responsabilidad
</commit_message>
<xml_diff>
--- a/siniestros/plantillas/convenio.docx
+++ b/siniestros/plantillas/convenio.docx
@@ -595,8 +595,18 @@
         <w:jc w:val="both"/>
         <w:rPr>
           <w:rFonts w:ascii="Calibri" w:hAnsi="Calibri" w:cs="Calibri"/>
-        </w:rPr>
-      </w:pPr>
+          <w:sz w:val="22"/>
+          <w:szCs w:val="22"/>
+        </w:rPr>
+      </w:pPr>
+      <w:r>
+        <w:rPr>
+          <w:rFonts w:ascii="Calibri" w:hAnsi="Calibri" w:cs="Calibri"/>
+          <w:sz w:val="22"/>
+          <w:szCs w:val="22"/>
+        </w:rPr>
+        <w:t>A bien convenir del centro de capacitación del personal operativo del transporte del estado de Querétaro S.A. de C.V. se deslinda de toda responsabilidad e incumplimiento de alguna de las partes involucradas.</w:t>
+      </w:r>
     </w:p>
     <w:p>
       <w:pPr>
@@ -615,30 +625,6 @@
         </w:rPr>
         <w:t>Ambas partes manifiestan que el presente convenio se celebra de forma libre y voluntaria, sin dolo ni coacción, obligándose a cumplir en sus términos.</w:t>
       </w:r>
-    </w:p>
-    <w:p>
-      <w:pPr>
-        <w:tabs>
-          <w:tab w:val="left" w:pos="2760"/>
-          <w:tab w:val="right" w:pos="8838"/>
-        </w:tabs>
-        <w:jc w:val="both"/>
-        <w:rPr>
-          <w:rFonts w:ascii="Calibri" w:hAnsi="Calibri" w:cs="Calibri"/>
-        </w:rPr>
-      </w:pPr>
-    </w:p>
-    <w:p>
-      <w:pPr>
-        <w:tabs>
-          <w:tab w:val="left" w:pos="2760"/>
-          <w:tab w:val="right" w:pos="8838"/>
-        </w:tabs>
-        <w:jc w:val="both"/>
-        <w:rPr>
-          <w:rFonts w:ascii="Calibri" w:hAnsi="Calibri" w:cs="Calibri"/>
-        </w:rPr>
-      </w:pPr>
     </w:p>
     <w:p>
       <w:pPr>

</xml_diff>

<commit_message>
Convenio: ajuste de redacción del deslinde
</commit_message>
<xml_diff>
--- a/siniestros/plantillas/convenio.docx
+++ b/siniestros/plantillas/convenio.docx
@@ -605,7 +605,119 @@
           <w:sz w:val="22"/>
           <w:szCs w:val="22"/>
         </w:rPr>
-        <w:t>A bien convenir del centro de capacitación del personal operativo del transporte del estado de Querétaro S.A. de C.V. se deslinda de toda responsabilidad e incumplimiento de alguna de las partes involucradas.</w:t>
+        <w:t xml:space="preserve">A bien convenir del </w:t>
+      </w:r>
+      <w:r>
+        <w:rPr>
+          <w:rFonts w:ascii="Calibri" w:hAnsi="Calibri" w:cs="Calibri"/>
+          <w:sz w:val="22"/>
+          <w:szCs w:val="22"/>
+        </w:rPr>
+        <w:t>C</w:t>
+      </w:r>
+      <w:r>
+        <w:rPr>
+          <w:rFonts w:ascii="Calibri" w:hAnsi="Calibri" w:cs="Calibri"/>
+          <w:sz w:val="22"/>
+          <w:szCs w:val="22"/>
+        </w:rPr>
+        <w:t xml:space="preserve">entro de </w:t>
+      </w:r>
+      <w:r>
+        <w:rPr>
+          <w:rFonts w:ascii="Calibri" w:hAnsi="Calibri" w:cs="Calibri"/>
+          <w:sz w:val="22"/>
+          <w:szCs w:val="22"/>
+        </w:rPr>
+        <w:t>C</w:t>
+      </w:r>
+      <w:r>
+        <w:rPr>
+          <w:rFonts w:ascii="Calibri" w:hAnsi="Calibri" w:cs="Calibri"/>
+          <w:sz w:val="22"/>
+          <w:szCs w:val="22"/>
+        </w:rPr>
+        <w:t xml:space="preserve">apacitación del </w:t>
+      </w:r>
+      <w:r>
+        <w:rPr>
+          <w:rFonts w:ascii="Calibri" w:hAnsi="Calibri" w:cs="Calibri"/>
+          <w:sz w:val="22"/>
+          <w:szCs w:val="22"/>
+        </w:rPr>
+        <w:t>P</w:t>
+      </w:r>
+      <w:r>
+        <w:rPr>
+          <w:rFonts w:ascii="Calibri" w:hAnsi="Calibri" w:cs="Calibri"/>
+          <w:sz w:val="22"/>
+          <w:szCs w:val="22"/>
+        </w:rPr>
+        <w:t xml:space="preserve">ersonal </w:t>
+      </w:r>
+      <w:r>
+        <w:rPr>
+          <w:rFonts w:ascii="Calibri" w:hAnsi="Calibri" w:cs="Calibri"/>
+          <w:sz w:val="22"/>
+          <w:szCs w:val="22"/>
+        </w:rPr>
+        <w:t>O</w:t>
+      </w:r>
+      <w:r>
+        <w:rPr>
+          <w:rFonts w:ascii="Calibri" w:hAnsi="Calibri" w:cs="Calibri"/>
+          <w:sz w:val="22"/>
+          <w:szCs w:val="22"/>
+        </w:rPr>
+        <w:t xml:space="preserve">perativo del </w:t>
+      </w:r>
+      <w:r>
+        <w:rPr>
+          <w:rFonts w:ascii="Calibri" w:hAnsi="Calibri" w:cs="Calibri"/>
+          <w:sz w:val="22"/>
+          <w:szCs w:val="22"/>
+        </w:rPr>
+        <w:t>T</w:t>
+      </w:r>
+      <w:r>
+        <w:rPr>
+          <w:rFonts w:ascii="Calibri" w:hAnsi="Calibri" w:cs="Calibri"/>
+          <w:sz w:val="22"/>
+          <w:szCs w:val="22"/>
+        </w:rPr>
+        <w:t xml:space="preserve">ransporte del </w:t>
+      </w:r>
+      <w:r>
+        <w:rPr>
+          <w:rFonts w:ascii="Calibri" w:hAnsi="Calibri" w:cs="Calibri"/>
+          <w:sz w:val="22"/>
+          <w:szCs w:val="22"/>
+        </w:rPr>
+        <w:t>E</w:t>
+      </w:r>
+      <w:r>
+        <w:rPr>
+          <w:rFonts w:ascii="Calibri" w:hAnsi="Calibri" w:cs="Calibri"/>
+          <w:sz w:val="22"/>
+          <w:szCs w:val="22"/>
+        </w:rPr>
+        <w:t>stado de Querétaro S.A. de C.V.</w:t>
+      </w:r>
+      <w:r>
+        <w:rPr>
+          <w:rFonts w:ascii="Calibri" w:hAnsi="Calibri" w:cs="Calibri"/>
+          <w:sz w:val="22"/>
+          <w:szCs w:val="22"/>
+        </w:rPr>
+        <w:t xml:space="preserve"> , </w:t>
+      </w:r>
+      <w:r>
+        <w:rPr>
+          <w:rFonts w:ascii="Calibri" w:hAnsi="Calibri" w:cs="Calibri"/>
+          <w:sz w:val="22"/>
+          <w:szCs w:val="22"/>
+        </w:rPr>
+        <w:t>se deslinda de toda responsabilidad e incumplimiento de alguna de las partes involucradas.</w:t>
       </w:r>
     </w:p>
     <w:p>

</xml_diff>